<commit_message>
Area util validada em bancada: arrasto nas tres zonas, ancora pelo pe corrigida na borda do quadro e EPI vinculado a pessoa; cinto em modo ponto de acesso gravado e testado
</commit_message>
<xml_diff>
--- a/entregaveis/Tortuga_Gravacao_Firmware_Cinto.docx
+++ b/entregaveis/Tortuga_Gravacao_Firmware_Cinto.docx
@@ -4,211 +4,225 @@
   <w:body>
     <w:p>
       <w:pPr>
-        <w:spacing w:after="20"/>
+        <w:spacing w:before="260" w:after="80"/>
       </w:pPr>
       <w:r>
         <w:rPr>
           <w:b/>
           <w:color w:val="0071E3"/>
-          <w:sz w:val="38"/>
+          <w:sz w:val="28"/>
         </w:rPr>
         <w:t>Gravação do Firmware do Cinto (ESP32)</w:t>
       </w:r>
     </w:p>
     <w:p>
-      <w:pPr>
-        <w:spacing w:after="20"/>
-      </w:pPr>
       <w:r>
         <w:rPr>
           <w:b/>
+          <w:i w:val="0"/>
           <w:color w:val="1D1D1F"/>
-          <w:sz w:val="24"/>
+          <w:sz w:val="21"/>
         </w:rPr>
-        <w:t>Passo a passo — versão com portal de Wi-Fi</w:t>
+        <w:t>Versão MODO PONTO DE ACESSO — o cinto passa a ser a rede</w:t>
       </w:r>
     </w:p>
     <w:p>
-      <w:pPr>
-        <w:spacing w:after="120"/>
-      </w:pPr>
       <w:r>
         <w:rPr>
           <w:color w:val="6E6E73"/>
           <w:sz w:val="19"/>
         </w:rPr>
-        <w:t>Projeto Tortuga · Cinto de segurança ESP32 · FIAP × SPI</w:t>
-      </w:r>
-    </w:p>
-    <w:p>
-      <w:pPr>
-        <w:spacing w:after="60"/>
-        <w:jc w:val="both"/>
-      </w:pPr>
-      <w:r>
-        <w:rPr>
-          <w:b w:val="0"/>
-        </w:rPr>
-        <w:t>Guia para gravar o firmware novo do cinto (o que usa o portal WiFiManager). Faça isto com calma antes do dia da apresentação. O ESP32 só precisa estar ligado no PC pela USB.</w:t>
-      </w:r>
-    </w:p>
-    <w:p>
-      <w:pPr>
-        <w:spacing w:before="160" w:after="40"/>
-      </w:pPr>
-      <w:r>
-        <w:rPr>
-          <w:b/>
-          <w:color w:val="0071E3"/>
-          <w:sz w:val="26"/>
-        </w:rPr>
-        <w:t>1. Antes de começar (confira)</w:t>
-      </w:r>
-    </w:p>
-    <w:p>
-      <w:pPr>
-        <w:pStyle w:val="ListBullet"/>
-        <w:spacing w:after="20"/>
-      </w:pPr>
-      <w:r>
-        <w:rPr>
-          <w:b/>
-        </w:rPr>
-        <w:t xml:space="preserve">Arduino IDE </w:t>
-      </w:r>
-      <w:r>
-        <w:t>instalado, com o pacote de placas ESP32 já adicionado.</w:t>
-      </w:r>
-    </w:p>
-    <w:p>
-      <w:pPr>
-        <w:pStyle w:val="ListBullet"/>
-        <w:spacing w:after="20"/>
-      </w:pPr>
-      <w:r>
-        <w:rPr>
-          <w:b/>
-        </w:rPr>
-        <w:t xml:space="preserve">Cabo USB </w:t>
-      </w:r>
-      <w:r>
-        <w:t>que transmite dados (não só carga) e o cinto ESP32 em mãos.</w:t>
-      </w:r>
-    </w:p>
-    <w:p>
-      <w:pPr>
-        <w:pStyle w:val="ListBullet"/>
-        <w:spacing w:after="20"/>
-      </w:pPr>
-      <w:r>
-        <w:rPr>
-          <w:b/>
-        </w:rPr>
-        <w:t xml:space="preserve">Rede Wi-Fi 2,4 GHz </w:t>
-      </w:r>
-      <w:r>
-        <w:t>disponível (o ESP32 não pega 5 GHz).</w:t>
-      </w:r>
-    </w:p>
-    <w:p>
-      <w:pPr>
-        <w:spacing w:before="160" w:after="40"/>
-      </w:pPr>
-      <w:r>
-        <w:rPr>
-          <w:b/>
-          <w:color w:val="0071E3"/>
-          <w:sz w:val="26"/>
-        </w:rPr>
-        <w:t>2. Instalar a biblioteca WiFiManager</w:t>
-      </w:r>
-    </w:p>
-    <w:p>
-      <w:pPr>
-        <w:spacing w:after="60"/>
-        <w:jc w:val="both"/>
-      </w:pPr>
-      <w:r>
-        <w:rPr>
-          <w:b w:val="0"/>
-        </w:rPr>
-        <w:t xml:space="preserve">No Arduino IDE: </w:t>
-      </w:r>
-      <w:r>
-        <w:rPr>
-          <w:b/>
-        </w:rPr>
-        <w:t>Tools → Manage Libraries…</w:t>
-      </w:r>
-      <w:r>
-        <w:rPr>
-          <w:b w:val="0"/>
-        </w:rPr>
-        <w:t xml:space="preserve"> (ou o ícone de livros na barra lateral). Busque </w:t>
-      </w:r>
-      <w:r>
-        <w:rPr>
-          <w:b/>
-        </w:rPr>
-        <w:t>WiFiManager</w:t>
-      </w:r>
-      <w:r>
-        <w:rPr>
-          <w:b w:val="0"/>
-        </w:rPr>
-        <w:t xml:space="preserve"> e instale a de autor </w:t>
-      </w:r>
-      <w:r>
-        <w:rPr>
-          <w:b/>
-        </w:rPr>
-        <w:t>tzapu</w:t>
-      </w:r>
-      <w:r>
-        <w:rPr>
-          <w:b w:val="0"/>
-        </w:rPr>
-        <w:t>. Sem ela o código não compila.</w:t>
+        <w:t>Projeto Tortuga · Innovation Challenge CUP 2026 · FIAP × SPI</w:t>
       </w:r>
     </w:p>
     <w:tbl>
       <w:tblPr>
         <w:tblW w:type="auto" w:w="0"/>
+        <w:jc w:val="center"/>
         <w:tblLook w:firstColumn="1" w:firstRow="1" w:lastColumn="0" w:lastRow="0" w:noHBand="0" w:noVBand="1" w:val="04A0"/>
-        <w:tblBorders>
-          <w:top w:val="single" w:sz="4" w:color="D2D2D7"/>
-          <w:left w:val="single" w:sz="4" w:color="D2D2D7"/>
-          <w:bottom w:val="single" w:sz="4" w:color="D2D2D7"/>
-          <w:right w:val="single" w:sz="4" w:color="D2D2D7"/>
-          <w:insideH w:val="single" w:sz="4" w:color="D2D2D7"/>
-          <w:insideV w:val="single" w:sz="4" w:color="D2D2D7"/>
-        </w:tblBorders>
       </w:tblPr>
       <w:tblGrid>
-        <w:gridCol w:w="9936"/>
+        <w:gridCol w:w="10080"/>
       </w:tblGrid>
       <w:tr>
         <w:tc>
           <w:tcPr>
-            <w:tcW w:type="dxa" w:w="9936"/>
-            <w:shd w:val="clear" w:fill="FFF6EC"/>
+            <w:tcW w:type="dxa" w:w="10080"/>
+            <w:shd w:val="clear" w:fill="F1FAF3"/>
           </w:tcPr>
           <w:p>
             <w:pPr>
-              <w:spacing w:after="20"/>
+              <w:spacing w:after="60"/>
+            </w:pPr>
+            <w:r/>
+            <w:r>
+              <w:rPr>
+                <w:b/>
+                <w:color w:val="1E8E3E"/>
+                <w:sz w:val="21"/>
+              </w:rPr>
+              <w:t>Por que este firmware mudou</w:t>
+            </w:r>
+          </w:p>
+          <w:p>
+            <w:pPr>
+              <w:spacing w:after="40"/>
             </w:pPr>
             <w:r>
               <w:rPr>
-                <w:b/>
-                <w:color w:val="1D1D1F"/>
+                <w:sz w:val="20"/>
               </w:rPr>
-              <w:t xml:space="preserve">As outras bibliotecas </w:t>
+              <w:t xml:space="preserve">No ensaio no auditório da FIAP a rede é </w:t>
             </w:r>
             <w:r>
               <w:rPr>
+                <w:b/>
+                <w:sz w:val="20"/>
+              </w:rPr>
+              <w:t>cabeada e sem internet</w:t>
+            </w:r>
+            <w:r>
+              <w:rPr>
+                <w:sz w:val="20"/>
+              </w:rPr>
+              <w:t>, e o Windows se recusa a ligar o Ponto de acesso móvel nessa condição. Sem hotspot, o servidor não tinha caminho até o cinto.</w:t>
+            </w:r>
+          </w:p>
+          <w:p>
+            <w:pPr>
+              <w:spacing w:after="40"/>
+            </w:pPr>
+            <w:r>
+              <w:rPr>
+                <w:sz w:val="20"/>
+              </w:rPr>
+              <w:t xml:space="preserve">A solução foi inverter quem hospeda a rede: agora </w:t>
+            </w:r>
+            <w:r>
+              <w:rPr>
+                <w:b/>
+                <w:sz w:val="20"/>
+              </w:rPr>
+              <w:t>o cinto é o ponto de acesso</w:t>
+            </w:r>
+            <w:r>
+              <w:rPr>
+                <w:sz w:val="20"/>
+              </w:rPr>
+              <w:t xml:space="preserve">. Ele publica a rede </w:t>
+            </w:r>
+            <w:r>
+              <w:rPr>
+                <w:rFonts w:ascii="Consolas" w:hAnsi="Consolas"/>
                 <w:b w:val="0"/>
+                <w:sz w:val="19"/>
               </w:rPr>
-              <w:t>já devem estar instaladas de antes: Adafruit SSD1306, Adafruit GFX e ArduinoJson (6.x). Se faltar alguma, instale pelo mesmo menu.</w:t>
+              <w:t>Tortuga-Cinto</w:t>
+            </w:r>
+            <w:r>
+              <w:rPr>
+                <w:sz w:val="20"/>
+              </w:rPr>
+              <w:t xml:space="preserve"> e fica </w:t>
+            </w:r>
+            <w:r>
+              <w:rPr>
+                <w:b/>
+                <w:sz w:val="20"/>
+              </w:rPr>
+              <w:t>sempre</w:t>
+            </w:r>
+            <w:r>
+              <w:rPr>
+                <w:sz w:val="20"/>
+              </w:rPr>
+              <w:t xml:space="preserve"> no endereço </w:t>
+            </w:r>
+            <w:r>
+              <w:rPr>
+                <w:rFonts w:ascii="Consolas" w:hAnsi="Consolas"/>
+                <w:b w:val="0"/>
+                <w:sz w:val="19"/>
+              </w:rPr>
+              <w:t>192.168.4.1</w:t>
+            </w:r>
+            <w:r>
+              <w:rPr>
+                <w:sz w:val="20"/>
+              </w:rPr>
+              <w:t>. O notebook conecta nela; o cabo de rede segue livre para as câmeras.</w:t>
+            </w:r>
+          </w:p>
+          <w:p>
+            <w:pPr>
+              <w:spacing w:after="0"/>
+            </w:pPr>
+            <w:r>
+              <w:rPr>
+                <w:sz w:val="20"/>
+              </w:rPr>
+              <w:t xml:space="preserve">Isso resolve três coisas de uma vez: não depende do Windows, não depende de internet e </w:t>
+            </w:r>
+            <w:r>
+              <w:rPr>
+                <w:b/>
+                <w:sz w:val="20"/>
+              </w:rPr>
+              <w:t>acaba o IP dinâmico</w:t>
+            </w:r>
+            <w:r>
+              <w:rPr>
+                <w:sz w:val="20"/>
+              </w:rPr>
+              <w:t xml:space="preserve"> — não há mais DHCP, descoberta nem IP errado registrado.</w:t>
+            </w:r>
+          </w:p>
+        </w:tc>
+      </w:tr>
+    </w:tbl>
+    <w:p>
+      <w:pPr>
+        <w:spacing w:after="40"/>
+      </w:pPr>
+    </w:p>
+    <w:tbl>
+      <w:tblPr>
+        <w:tblW w:type="auto" w:w="0"/>
+        <w:jc w:val="center"/>
+        <w:tblLook w:firstColumn="1" w:firstRow="1" w:lastColumn="0" w:lastRow="0" w:noHBand="0" w:noVBand="1" w:val="04A0"/>
+      </w:tblPr>
+      <w:tblGrid>
+        <w:gridCol w:w="10080"/>
+      </w:tblGrid>
+      <w:tr>
+        <w:tc>
+          <w:tcPr>
+            <w:tcW w:type="dxa" w:w="10080"/>
+            <w:shd w:val="clear" w:fill="FDF6E9"/>
+          </w:tcPr>
+          <w:p>
+            <w:pPr>
+              <w:spacing w:after="60"/>
+            </w:pPr>
+            <w:r/>
+            <w:r>
+              <w:rPr>
+                <w:b/>
+                <w:color w:val="B26B00"/>
+                <w:sz w:val="21"/>
+              </w:rPr>
+              <w:t>Faça isto EM CASA, com calma — não no dia</w:t>
+            </w:r>
+          </w:p>
+          <w:p>
+            <w:pPr>
+              <w:spacing w:after="0"/>
+            </w:pPr>
+            <w:r>
+              <w:rPr>
+                <w:sz w:val="20"/>
+              </w:rPr>
+              <w:t>Separe uns 30 minutos. O ESP32 só precisa do cabo USB no PC; nada de câmera, nada de rede do evento.</w:t>
             </w:r>
           </w:p>
         </w:tc>
@@ -221,146 +235,294 @@
     </w:p>
     <w:p>
       <w:pPr>
-        <w:spacing w:before="160" w:after="40"/>
+        <w:spacing w:before="180" w:after="80"/>
       </w:pPr>
       <w:r>
         <w:rPr>
           <w:b/>
           <w:color w:val="0071E3"/>
-          <w:sz w:val="26"/>
+          <w:sz w:val="23"/>
         </w:rPr>
-        <w:t>3. Abrir o sketch</w:t>
+        <w:t>1. Antes de começar</w:t>
       </w:r>
     </w:p>
     <w:p>
       <w:pPr>
+        <w:pStyle w:val="ListBullet"/>
         <w:spacing w:after="60"/>
-        <w:jc w:val="both"/>
       </w:pPr>
       <w:r>
         <w:rPr>
-          <w:b w:val="0"/>
+          <w:sz w:val="21"/>
         </w:rPr>
-        <w:t xml:space="preserve">Abra o arquivo: </w:t>
-      </w:r>
-      <w:r>
-        <w:rPr>
-          <w:b/>
-        </w:rPr>
-        <w:t>C:\tortuga\firmware\tortuga_esp32\tortuga_esp32.ino</w:t>
-      </w:r>
-      <w:r>
-        <w:rPr>
-          <w:b w:val="0"/>
-        </w:rPr>
-        <w:t xml:space="preserve"> (File → Open).</w:t>
+        <w:t>Arduino IDE instalado, com o pacote de placas ESP32 já adicionado.</w:t>
       </w:r>
     </w:p>
     <w:p>
       <w:pPr>
-        <w:spacing w:before="160" w:after="40"/>
+        <w:pStyle w:val="ListBullet"/>
+        <w:spacing w:after="60"/>
+      </w:pPr>
+      <w:r>
+        <w:rPr>
+          <w:sz w:val="21"/>
+        </w:rPr>
+        <w:t>Cabo USB que transmite dados (não só carga) e o cinto em mãos.</w:t>
+      </w:r>
+    </w:p>
+    <w:p>
+      <w:pPr>
+        <w:pStyle w:val="ListBullet"/>
+        <w:spacing w:after="60"/>
+      </w:pPr>
+      <w:r>
+        <w:rPr>
+          <w:b/>
+          <w:sz w:val="21"/>
+        </w:rPr>
+        <w:t>Nenhuma biblioteca nova para instalar.</w:t>
+      </w:r>
+      <w:r>
+        <w:rPr>
+          <w:sz w:val="21"/>
+        </w:rPr>
+        <w:t xml:space="preserve"> A única novidade do código é a </w:t>
+      </w:r>
+      <w:r>
+        <w:rPr>
+          <w:rFonts w:ascii="Consolas" w:hAnsi="Consolas"/>
+          <w:b w:val="0"/>
+          <w:sz w:val="19"/>
+        </w:rPr>
+        <w:t>Preferences</w:t>
+      </w:r>
+      <w:r>
+        <w:rPr>
+          <w:sz w:val="21"/>
+        </w:rPr>
+        <w:t>, que já vem dentro do core do ESP32. WiFiManager, ArduinoJson e as Adafruit você já tem de antes.</w:t>
+      </w:r>
+    </w:p>
+    <w:p>
+      <w:pPr>
+        <w:spacing w:before="180" w:after="80"/>
       </w:pPr>
       <w:r>
         <w:rPr>
           <w:b/>
           <w:color w:val="0071E3"/>
-          <w:sz w:val="26"/>
+          <w:sz w:val="23"/>
         </w:rPr>
-        <w:t>4. Selecionar a placa e a porta</w:t>
+        <w:t>2. Gravar</w:t>
       </w:r>
     </w:p>
     <w:p>
       <w:pPr>
-        <w:spacing w:after="40"/>
-        <w:ind w:left="360"/>
+        <w:pStyle w:val="ListNumber"/>
+        <w:spacing w:after="60"/>
       </w:pPr>
       <w:r>
         <w:rPr>
           <w:b/>
+          <w:sz w:val="21"/>
         </w:rPr>
-        <w:t xml:space="preserve">1. </w:t>
+        <w:t>Abrir o sketch.</w:t>
+      </w:r>
+      <w:r>
+        <w:rPr>
+          <w:sz w:val="21"/>
+        </w:rPr>
+        <w:t xml:space="preserve"> File → Open → </w:t>
+      </w:r>
+      <w:r>
+        <w:rPr>
+          <w:rFonts w:ascii="Consolas" w:hAnsi="Consolas"/>
+          <w:b w:val="0"/>
+          <w:sz w:val="19"/>
+        </w:rPr>
+        <w:t>C:\tortuga\firmware\tortuga_esp32\tortuga_esp32.ino</w:t>
+      </w:r>
+    </w:p>
+    <w:p>
+      <w:pPr>
+        <w:pStyle w:val="ListNumber"/>
+        <w:spacing w:after="60"/>
+      </w:pPr>
+      <w:r>
+        <w:rPr>
+          <w:b/>
+          <w:sz w:val="21"/>
+        </w:rPr>
+        <w:t>Placa.</w:t>
+      </w:r>
+      <w:r>
+        <w:rPr>
+          <w:sz w:val="21"/>
+        </w:rPr>
+        <w:t xml:space="preserve"> Tools → Board → ESP32 Arduino → </w:t>
       </w:r>
       <w:r>
         <w:rPr>
           <w:b/>
+          <w:sz w:val="21"/>
         </w:rPr>
-        <w:t xml:space="preserve">Placa: </w:t>
-      </w:r>
-      <w:r>
-        <w:t>Tools → Board → ESP32 Arduino → "ESP32 Dev Module".</w:t>
+        <w:t>ESP32 Dev Module</w:t>
       </w:r>
     </w:p>
     <w:p>
       <w:pPr>
-        <w:spacing w:after="40"/>
-        <w:ind w:left="360"/>
+        <w:pStyle w:val="ListNumber"/>
+        <w:spacing w:after="60"/>
       </w:pPr>
       <w:r>
         <w:rPr>
           <w:b/>
+          <w:sz w:val="21"/>
         </w:rPr>
-        <w:t xml:space="preserve">2. </w:t>
+        <w:t>Porta.</w:t>
       </w:r>
       <w:r>
         <w:rPr>
+          <w:sz w:val="21"/>
+        </w:rPr>
+        <w:t xml:space="preserve"> Conecte o ESP no USB e escolha em Tools → Port a COM que apareceu.</w:t>
+      </w:r>
+    </w:p>
+    <w:p>
+      <w:pPr>
+        <w:pStyle w:val="ListNumber"/>
+        <w:spacing w:after="60"/>
+      </w:pPr>
+      <w:r>
+        <w:rPr>
           <w:b/>
+          <w:sz w:val="21"/>
         </w:rPr>
-        <w:t xml:space="preserve">Conecte o ESP </w:t>
+        <w:t>Upload</w:t>
       </w:r>
       <w:r>
-        <w:t>no USB. Em seguida: Tools → Port → selecione a porta COM que apareceu (ex.: COM3).</w:t>
+        <w:rPr>
+          <w:sz w:val="21"/>
+        </w:rPr>
+        <w:t xml:space="preserve"> (a seta →). Se travar em </w:t>
+      </w:r>
+      <w:r>
+        <w:rPr>
+          <w:rFonts w:ascii="Consolas" w:hAnsi="Consolas"/>
+          <w:b w:val="0"/>
+          <w:sz w:val="19"/>
+        </w:rPr>
+        <w:t>Connecting….....</w:t>
+      </w:r>
+      <w:r>
+        <w:rPr>
+          <w:sz w:val="21"/>
+        </w:rPr>
+        <w:t>, segure o botão BOOT até a gravação começar.</w:t>
       </w:r>
     </w:p>
     <w:tbl>
       <w:tblPr>
         <w:tblW w:type="auto" w:w="0"/>
+        <w:jc w:val="center"/>
         <w:tblLook w:firstColumn="1" w:firstRow="1" w:lastColumn="0" w:lastRow="0" w:noHBand="0" w:noVBand="1" w:val="04A0"/>
-        <w:tblBorders>
-          <w:top w:val="single" w:sz="4" w:color="D2D2D7"/>
-          <w:left w:val="single" w:sz="4" w:color="D2D2D7"/>
-          <w:bottom w:val="single" w:sz="4" w:color="D2D2D7"/>
-          <w:right w:val="single" w:sz="4" w:color="D2D2D7"/>
-          <w:insideH w:val="single" w:sz="4" w:color="D2D2D7"/>
-          <w:insideV w:val="single" w:sz="4" w:color="D2D2D7"/>
-        </w:tblBorders>
       </w:tblPr>
       <w:tblGrid>
-        <w:gridCol w:w="9936"/>
+        <w:gridCol w:w="10080"/>
       </w:tblGrid>
       <w:tr>
         <w:tc>
           <w:tcPr>
-            <w:tcW w:type="dxa" w:w="9936"/>
-            <w:shd w:val="clear" w:fill="FFF6EC"/>
+            <w:tcW w:type="dxa" w:w="10080"/>
+            <w:shd w:val="clear" w:fill="FDECEB"/>
           </w:tcPr>
           <w:p>
             <w:pPr>
-              <w:spacing w:after="20"/>
+              <w:spacing w:after="60"/>
             </w:pPr>
+            <w:r/>
             <w:r>
               <w:rPr>
                 <w:b/>
-                <w:color w:val="B26B00"/>
+                <w:color w:val="C81E14"/>
+                <w:sz w:val="21"/>
               </w:rPr>
-              <w:t xml:space="preserve">Não aparece nenhuma porta? </w:t>
-            </w:r>
-            <w:r>
-              <w:rPr>
-                <w:b w:val="0"/>
-              </w:rPr>
-              <w:t>Falta o driver CP210x. Baixe o "CP210x VCP Driver" da Silicon Labs, instale, desconecte e reconecte o ESP:</w:t>
+              <w:t>ATENÇÃO — a pegadinha nova</w:t>
             </w:r>
           </w:p>
           <w:p>
             <w:pPr>
-              <w:spacing w:after="20"/>
+              <w:spacing w:after="40"/>
             </w:pPr>
             <w:r>
               <w:rPr>
+                <w:sz w:val="20"/>
+              </w:rPr>
+              <w:t xml:space="preserve">Depois do </w:t>
+            </w:r>
+            <w:r>
+              <w:rPr>
+                <w:rFonts w:ascii="Consolas" w:hAnsi="Consolas"/>
                 <w:b w:val="0"/>
-                <w:color w:val="0071E3"/>
+                <w:sz w:val="19"/>
               </w:rPr>
-              <w:t>https://www.silabs.com/developers/usb-to-uart-bridge-vcp-drivers</w:t>
+              <w:t>Done uploading</w:t>
+            </w:r>
+            <w:r>
+              <w:rPr>
+                <w:sz w:val="20"/>
+              </w:rPr>
+              <w:t xml:space="preserve">, aperte </w:t>
+            </w:r>
+            <w:r>
+              <w:rPr>
+                <w:b/>
+                <w:sz w:val="20"/>
+              </w:rPr>
+              <w:t>RST sozinho</w:t>
+            </w:r>
+            <w:r>
+              <w:rPr>
+                <w:sz w:val="20"/>
+              </w:rPr>
+              <w:t xml:space="preserve">, </w:t>
+            </w:r>
+            <w:r>
+              <w:rPr>
+                <w:b/>
+                <w:sz w:val="20"/>
+              </w:rPr>
+              <w:t>sem segurar BOOT</w:t>
+            </w:r>
+            <w:r>
+              <w:rPr>
+                <w:sz w:val="20"/>
+              </w:rPr>
+              <w:t>.</w:t>
+            </w:r>
+          </w:p>
+          <w:p>
+            <w:pPr>
+              <w:spacing w:after="0"/>
+            </w:pPr>
+            <w:r>
+              <w:rPr>
+                <w:sz w:val="20"/>
+              </w:rPr>
+              <w:t xml:space="preserve">Neste firmware o botão BOOT </w:t>
+            </w:r>
+            <w:r>
+              <w:rPr>
+                <w:b/>
+                <w:sz w:val="20"/>
+              </w:rPr>
+              <w:t>alterna o modo de rede</w:t>
+            </w:r>
+            <w:r>
+              <w:rPr>
+                <w:sz w:val="20"/>
+              </w:rPr>
+              <w:t xml:space="preserve"> — ele não limpa mais o Wi-Fi salvo, como fazia na versão anterior. Se você apertar os dois por hábito, o cinto sai do modo ponto de acesso e você vai achar que a gravação falhou.</w:t>
             </w:r>
           </w:p>
         </w:tc>
@@ -373,79 +535,315 @@
     </w:p>
     <w:p>
       <w:pPr>
-        <w:spacing w:before="160" w:after="40"/>
+        <w:spacing w:before="180" w:after="80"/>
       </w:pPr>
       <w:r>
         <w:rPr>
           <w:b/>
           <w:color w:val="0071E3"/>
-          <w:sz w:val="26"/>
+          <w:sz w:val="23"/>
         </w:rPr>
-        <w:t>5. Compilar e enviar</w:t>
+        <w:t>3. Conferir que deu certo</w:t>
+      </w:r>
+    </w:p>
+    <w:p>
+      <w:r>
+        <w:rPr>
+          <w:sz w:val="21"/>
+        </w:rPr>
+        <w:t>Três verificações, em ordem. Se as três passarem, o cinto está pronto e você não precisa mexer mais nele.</w:t>
       </w:r>
     </w:p>
     <w:p>
       <w:pPr>
-        <w:spacing w:after="60"/>
-        <w:jc w:val="both"/>
+        <w:spacing w:before="180" w:after="80"/>
       </w:pPr>
       <w:r>
         <w:rPr>
-          <w:b w:val="0"/>
+          <w:b/>
+          <w:color w:val="1D1D1F"/>
+          <w:sz w:val="23"/>
         </w:rPr>
-        <w:t xml:space="preserve">Clique no botão </w:t>
+        <w:t>3.1 No display do cinto</w:t>
       </w:r>
+    </w:p>
+    <w:p>
       <w:r>
         <w:rPr>
-          <w:b/>
+          <w:sz w:val="21"/>
         </w:rPr>
-        <w:t>Upload (a seta →)</w:t>
-      </w:r>
-      <w:r>
-        <w:rPr>
-          <w:b w:val="0"/>
-        </w:rPr>
-        <w:t xml:space="preserve"> no canto superior esquerdo. Ele compila e grava. Aguarde até "Done uploading".</w:t>
+        <w:t>Logo após o reset, por cerca de 4 segundos, o OLED deve mostrar:</w:t>
       </w:r>
     </w:p>
     <w:tbl>
       <w:tblPr>
         <w:tblW w:type="auto" w:w="0"/>
+        <w:jc w:val="center"/>
         <w:tblLook w:firstColumn="1" w:firstRow="1" w:lastColumn="0" w:lastRow="0" w:noHBand="0" w:noVBand="1" w:val="04A0"/>
-        <w:tblBorders>
-          <w:top w:val="single" w:sz="4" w:color="D2D2D7"/>
-          <w:left w:val="single" w:sz="4" w:color="D2D2D7"/>
-          <w:bottom w:val="single" w:sz="4" w:color="D2D2D7"/>
-          <w:right w:val="single" w:sz="4" w:color="D2D2D7"/>
-          <w:insideH w:val="single" w:sz="4" w:color="D2D2D7"/>
-          <w:insideV w:val="single" w:sz="4" w:color="D2D2D7"/>
-        </w:tblBorders>
       </w:tblPr>
       <w:tblGrid>
-        <w:gridCol w:w="9936"/>
+        <w:gridCol w:w="10080"/>
       </w:tblGrid>
       <w:tr>
         <w:tc>
           <w:tcPr>
-            <w:tcW w:type="dxa" w:w="9936"/>
-            <w:shd w:val="clear" w:fill="FFF6EC"/>
+            <w:tcW w:type="dxa" w:w="10080"/>
+            <w:shd w:val="clear" w:fill="F5F5F7"/>
           </w:tcPr>
           <w:p>
             <w:pPr>
-              <w:spacing w:after="20"/>
+              <w:spacing w:after="40"/>
+            </w:pPr>
+            <w:r/>
+            <w:r>
+              <w:rPr>
+                <w:rFonts w:ascii="Consolas" w:hAnsi="Consolas"/>
+                <w:b/>
+                <w:sz w:val="19"/>
+              </w:rPr>
+              <w:t>CINTO = PONTO ACESSO</w:t>
+            </w:r>
+          </w:p>
+          <w:p>
+            <w:pPr>
+              <w:spacing w:after="40"/>
             </w:pPr>
             <w:r>
               <w:rPr>
-                <w:b/>
-                <w:color w:val="B26B00"/>
+                <w:rFonts w:ascii="Consolas" w:hAnsi="Consolas"/>
+                <w:b w:val="0"/>
+                <w:sz w:val="19"/>
               </w:rPr>
-              <w:t xml:space="preserve">Se travar em "Connecting…....": </w:t>
+              <w:t>rede  Tortuga-Cinto</w:t>
             </w:r>
+          </w:p>
+          <w:p>
+            <w:pPr>
+              <w:spacing w:after="40"/>
+            </w:pPr>
             <w:r>
               <w:rPr>
+                <w:rFonts w:ascii="Consolas" w:hAnsi="Consolas"/>
                 <w:b w:val="0"/>
+                <w:sz w:val="19"/>
               </w:rPr>
-              <w:t>segure o botão BOOT do ESP durante a conexão e solte quando começar a gravar. (A maioria das placas não precisa disso.)</w:t>
+              <w:t>senha tortuga2026</w:t>
+            </w:r>
+          </w:p>
+          <w:p>
+            <w:pPr>
+              <w:spacing w:after="40"/>
+            </w:pPr>
+            <w:r>
+              <w:rPr>
+                <w:rFonts w:ascii="Consolas" w:hAnsi="Consolas"/>
+                <w:b w:val="0"/>
+                <w:sz w:val="19"/>
+              </w:rPr>
+              <w:t>Conecte o notebook</w:t>
+            </w:r>
+          </w:p>
+          <w:p>
+            <w:pPr>
+              <w:spacing w:after="0"/>
+            </w:pPr>
+            <w:r>
+              <w:rPr>
+                <w:rFonts w:ascii="Consolas" w:hAnsi="Consolas"/>
+                <w:b w:val="0"/>
+                <w:sz w:val="19"/>
+              </w:rPr>
+              <w:t>IP 192.168.4.1</w:t>
+            </w:r>
+          </w:p>
+        </w:tc>
+      </w:tr>
+    </w:tbl>
+    <w:p>
+      <w:pPr>
+        <w:spacing w:after="40"/>
+      </w:pPr>
+    </w:p>
+    <w:p>
+      <w:r>
+        <w:rPr>
+          <w:sz w:val="21"/>
+        </w:rPr>
+        <w:t xml:space="preserve">Em seguida ele vai para </w:t>
+      </w:r>
+      <w:r>
+        <w:rPr>
+          <w:rFonts w:ascii="Consolas" w:hAnsi="Consolas"/>
+          <w:b w:val="0"/>
+          <w:i w:val="0"/>
+          <w:sz w:val="19"/>
+        </w:rPr>
+        <w:t>CONFORME / Pode trabalhar</w:t>
+      </w:r>
+      <w:r>
+        <w:rPr>
+          <w:sz w:val="21"/>
+        </w:rPr>
+        <w:t xml:space="preserve"> e o LED verde acende. No Serial Monitor a 115200 aparece a mesma informação.</w:t>
+      </w:r>
+    </w:p>
+    <w:p>
+      <w:pPr>
+        <w:spacing w:before="180" w:after="80"/>
+      </w:pPr>
+      <w:r>
+        <w:rPr>
+          <w:b/>
+          <w:color w:val="1D1D1F"/>
+          <w:sz w:val="23"/>
+        </w:rPr>
+        <w:t>3.2 No navegador do notebook</w:t>
+      </w:r>
+    </w:p>
+    <w:p>
+      <w:r>
+        <w:rPr>
+          <w:b/>
+          <w:i w:val="0"/>
+          <w:sz w:val="21"/>
+        </w:rPr>
+        <w:t xml:space="preserve">1. </w:t>
+      </w:r>
+      <w:r>
+        <w:rPr>
+          <w:sz w:val="21"/>
+        </w:rPr>
+        <w:t xml:space="preserve">Conecte o </w:t>
+      </w:r>
+      <w:r>
+        <w:rPr>
+          <w:b/>
+          <w:i w:val="0"/>
+          <w:sz w:val="21"/>
+        </w:rPr>
+        <w:t>Wi-Fi do notebook</w:t>
+      </w:r>
+      <w:r>
+        <w:rPr>
+          <w:sz w:val="21"/>
+        </w:rPr>
+        <w:t xml:space="preserve"> na rede </w:t>
+      </w:r>
+      <w:r>
+        <w:rPr>
+          <w:rFonts w:ascii="Consolas" w:hAnsi="Consolas"/>
+          <w:b w:val="0"/>
+          <w:i w:val="0"/>
+          <w:sz w:val="19"/>
+        </w:rPr>
+        <w:t>Tortuga-Cinto</w:t>
+      </w:r>
+      <w:r>
+        <w:rPr>
+          <w:sz w:val="21"/>
+        </w:rPr>
+        <w:t xml:space="preserve"> — senha </w:t>
+      </w:r>
+      <w:r>
+        <w:rPr>
+          <w:rFonts w:ascii="Consolas" w:hAnsi="Consolas"/>
+          <w:b w:val="0"/>
+          <w:i w:val="0"/>
+          <w:sz w:val="19"/>
+        </w:rPr>
+        <w:t>tortuga2026</w:t>
+      </w:r>
+      <w:r>
+        <w:rPr>
+          <w:sz w:val="21"/>
+        </w:rPr>
+        <w:t>.</w:t>
+      </w:r>
+    </w:p>
+    <w:p>
+      <w:r>
+        <w:rPr>
+          <w:b/>
+          <w:i w:val="0"/>
+          <w:sz w:val="21"/>
+        </w:rPr>
+        <w:t xml:space="preserve">2. </w:t>
+      </w:r>
+      <w:r>
+        <w:rPr>
+          <w:sz w:val="21"/>
+        </w:rPr>
+        <w:t xml:space="preserve">Abra </w:t>
+      </w:r>
+      <w:r>
+        <w:rPr>
+          <w:rFonts w:ascii="Consolas" w:hAnsi="Consolas"/>
+          <w:b w:val="0"/>
+          <w:i w:val="0"/>
+          <w:sz w:val="19"/>
+        </w:rPr>
+        <w:t>http://192.168.4.1/</w:t>
+      </w:r>
+      <w:r>
+        <w:rPr>
+          <w:sz w:val="21"/>
+        </w:rPr>
+        <w:t xml:space="preserve"> no navegador. Deve responder:</w:t>
+      </w:r>
+    </w:p>
+    <w:tbl>
+      <w:tblPr>
+        <w:tblW w:type="auto" w:w="0"/>
+        <w:jc w:val="center"/>
+        <w:tblLook w:firstColumn="1" w:firstRow="1" w:lastColumn="0" w:lastRow="0" w:noHBand="0" w:noVBand="1" w:val="04A0"/>
+      </w:tblPr>
+      <w:tblGrid>
+        <w:gridCol w:w="10080"/>
+      </w:tblGrid>
+      <w:tr>
+        <w:tc>
+          <w:tcPr>
+            <w:tcW w:type="dxa" w:w="10080"/>
+            <w:shd w:val="clear" w:fill="F5F5F7"/>
+          </w:tcPr>
+          <w:p>
+            <w:pPr>
+              <w:spacing w:after="40"/>
+            </w:pPr>
+            <w:r/>
+            <w:r>
+              <w:rPr>
+                <w:rFonts w:ascii="Consolas" w:hAnsi="Consolas"/>
+                <w:b w:val="0"/>
+                <w:sz w:val="19"/>
+              </w:rPr>
+              <w:t>Tortuga ESP32 OK. POST /status</w:t>
+            </w:r>
+          </w:p>
+          <w:p>
+            <w:pPr>
+              <w:spacing w:after="40"/>
+            </w:pPr>
+            <w:r>
+              <w:rPr>
+                <w:rFonts w:ascii="Consolas" w:hAnsi="Consolas"/>
+                <w:b w:val="0"/>
+                <w:sz w:val="19"/>
+              </w:rPr>
+              <w:t>modo=AP</w:t>
+            </w:r>
+          </w:p>
+          <w:p>
+            <w:pPr>
+              <w:spacing w:after="0"/>
+            </w:pPr>
+            <w:r>
+              <w:rPr>
+                <w:rFonts w:ascii="Consolas" w:hAnsi="Consolas"/>
+                <w:b w:val="0"/>
+                <w:sz w:val="19"/>
+              </w:rPr>
+              <w:t>ip=192.168.4.1</w:t>
             </w:r>
           </w:p>
         </w:tc>
@@ -458,115 +856,639 @@
     </w:p>
     <w:p>
       <w:pPr>
-        <w:spacing w:before="160" w:after="40"/>
+        <w:spacing w:before="180" w:after="80"/>
+      </w:pPr>
+      <w:r>
+        <w:rPr>
+          <w:b/>
+          <w:color w:val="1D1D1F"/>
+          <w:sz w:val="23"/>
+        </w:rPr>
+        <w:t>3.3 O cinto reagindo de verdade</w:t>
+      </w:r>
+    </w:p>
+    <w:p>
+      <w:r>
+        <w:rPr>
+          <w:sz w:val="21"/>
+        </w:rPr>
+        <w:t xml:space="preserve">Rode </w:t>
+      </w:r>
+      <w:r>
+        <w:rPr>
+          <w:rFonts w:ascii="Consolas" w:hAnsi="Consolas"/>
+          <w:b w:val="0"/>
+          <w:i w:val="0"/>
+          <w:sz w:val="19"/>
+        </w:rPr>
+        <w:t>testar_cinto.bat</w:t>
+      </w:r>
+      <w:r>
+        <w:rPr>
+          <w:sz w:val="21"/>
+        </w:rPr>
+        <w:t xml:space="preserve"> e digite </w:t>
+      </w:r>
+      <w:r>
+        <w:rPr>
+          <w:rFonts w:ascii="Consolas" w:hAnsi="Consolas"/>
+          <w:b w:val="0"/>
+          <w:i w:val="0"/>
+          <w:sz w:val="19"/>
+        </w:rPr>
+        <w:t>192.168.4.1</w:t>
+      </w:r>
+      <w:r>
+        <w:rPr>
+          <w:sz w:val="21"/>
+        </w:rPr>
+        <w:t xml:space="preserve">. O cinto deve ficar </w:t>
+      </w:r>
+      <w:r>
+        <w:rPr>
+          <w:b/>
+          <w:i w:val="0"/>
+          <w:sz w:val="21"/>
+        </w:rPr>
+        <w:t>vermelho, apitar e vibrar</w:t>
+      </w:r>
+      <w:r>
+        <w:rPr>
+          <w:sz w:val="21"/>
+        </w:rPr>
+        <w:t xml:space="preserve"> por uns 7 segundos e voltar ao verde sozinho. É o mesmo comando que o dashboard envia numa violação real.</w:t>
+      </w:r>
+    </w:p>
+    <w:p>
+      <w:pPr>
+        <w:spacing w:before="180" w:after="80"/>
       </w:pPr>
       <w:r>
         <w:rPr>
           <w:b/>
           <w:color w:val="0071E3"/>
-          <w:sz w:val="26"/>
+          <w:sz w:val="23"/>
         </w:rPr>
-        <w:t>6. Configurar o Wi-Fi pelo portal (1º boot)</w:t>
+        <w:t>4. Os dois modos de rede</w:t>
+      </w:r>
+    </w:p>
+    <w:tbl>
+      <w:tblPr>
+        <w:tblStyle w:val="TableGrid"/>
+        <w:tblW w:type="auto" w:w="0"/>
+        <w:tblLook w:firstColumn="1" w:firstRow="1" w:lastColumn="0" w:lastRow="0" w:noHBand="0" w:noVBand="1" w:val="04A0"/>
+      </w:tblPr>
+      <w:tblGrid>
+        <w:gridCol w:w="3360"/>
+        <w:gridCol w:w="3360"/>
+        <w:gridCol w:w="3360"/>
+      </w:tblGrid>
+      <w:tr>
+        <w:tc>
+          <w:tcPr>
+            <w:tcW w:type="dxa" w:w="1008"/>
+            <w:shd w:val="clear" w:fill="EAF2FD"/>
+          </w:tcPr>
+          <w:p>
+            <w:r/>
+            <w:r>
+              <w:rPr>
+                <w:b/>
+                <w:color w:val="0071E3"/>
+                <w:sz w:val="19"/>
+              </w:rPr>
+              <w:t>Modo</w:t>
+            </w:r>
+          </w:p>
+        </w:tc>
+        <w:tc>
+          <w:tcPr>
+            <w:tcW w:type="dxa" w:w="4896"/>
+            <w:shd w:val="clear" w:fill="EAF2FD"/>
+          </w:tcPr>
+          <w:p>
+            <w:r/>
+            <w:r>
+              <w:rPr>
+                <w:b/>
+                <w:color w:val="0071E3"/>
+                <w:sz w:val="19"/>
+              </w:rPr>
+              <w:t>O que faz</w:t>
+            </w:r>
+          </w:p>
+        </w:tc>
+        <w:tc>
+          <w:tcPr>
+            <w:tcW w:type="dxa" w:w="4176"/>
+            <w:shd w:val="clear" w:fill="EAF2FD"/>
+          </w:tcPr>
+          <w:p>
+            <w:r/>
+            <w:r>
+              <w:rPr>
+                <w:b/>
+                <w:color w:val="0071E3"/>
+                <w:sz w:val="19"/>
+              </w:rPr>
+              <w:t>Quando usar</w:t>
+            </w:r>
+          </w:p>
+        </w:tc>
+      </w:tr>
+      <w:tr>
+        <w:tc>
+          <w:tcPr>
+            <w:tcW w:type="dxa" w:w="1008"/>
+          </w:tcPr>
+          <w:p>
+            <w:r/>
+            <w:r>
+              <w:rPr>
+                <w:b/>
+                <w:sz w:val="19"/>
+              </w:rPr>
+              <w:t>AP</w:t>
+            </w:r>
+          </w:p>
+        </w:tc>
+        <w:tc>
+          <w:tcPr>
+            <w:tcW w:type="dxa" w:w="4896"/>
+          </w:tcPr>
+          <w:p>
+            <w:r/>
+            <w:r>
+              <w:rPr>
+                <w:sz w:val="19"/>
+              </w:rPr>
+              <w:t>O cinto publica a rede Tortuga-Cinto e fica fixo em 192.168.4.1</w:t>
+            </w:r>
+          </w:p>
+        </w:tc>
+        <w:tc>
+          <w:tcPr>
+            <w:tcW w:type="dxa" w:w="4176"/>
+          </w:tcPr>
+          <w:p>
+            <w:r/>
+            <w:r>
+              <w:rPr>
+                <w:sz w:val="19"/>
+              </w:rPr>
+              <w:t>Padrão. Rede cabeada, sem internet, sem hotspot — o caso da Arena.</w:t>
+            </w:r>
+          </w:p>
+        </w:tc>
+      </w:tr>
+      <w:tr>
+        <w:tc>
+          <w:tcPr>
+            <w:tcW w:type="dxa" w:w="1008"/>
+          </w:tcPr>
+          <w:p>
+            <w:r/>
+            <w:r>
+              <w:rPr>
+                <w:b/>
+                <w:sz w:val="19"/>
+              </w:rPr>
+              <w:t>STA</w:t>
+            </w:r>
+          </w:p>
+        </w:tc>
+        <w:tc>
+          <w:tcPr>
+            <w:tcW w:type="dxa" w:w="4896"/>
+          </w:tcPr>
+          <w:p>
+            <w:r/>
+            <w:r>
+              <w:rPr>
+                <w:sz w:val="19"/>
+              </w:rPr>
+              <w:t>O cinto entra numa rede existente, via portal de configuração</w:t>
+            </w:r>
+          </w:p>
+        </w:tc>
+        <w:tc>
+          <w:tcPr>
+            <w:tcW w:type="dxa" w:w="4176"/>
+          </w:tcPr>
+          <w:p>
+            <w:r/>
+            <w:r>
+              <w:rPr>
+                <w:sz w:val="19"/>
+              </w:rPr>
+              <w:t>Quando houver hotspot disponível, como foi na metaindústria.</w:t>
+            </w:r>
+          </w:p>
+        </w:tc>
+      </w:tr>
+    </w:tbl>
+    <w:p>
+      <w:pPr>
+        <w:spacing w:after="40"/>
+      </w:pPr>
+    </w:p>
+    <w:p>
+      <w:r>
+        <w:rPr>
+          <w:b/>
+          <w:i w:val="0"/>
+          <w:sz w:val="21"/>
+        </w:rPr>
+        <w:t xml:space="preserve">Para alternar: </w:t>
+      </w:r>
+      <w:r>
+        <w:rPr>
+          <w:sz w:val="21"/>
+        </w:rPr>
+        <w:t xml:space="preserve">segure </w:t>
+      </w:r>
+      <w:r>
+        <w:rPr>
+          <w:b/>
+          <w:i w:val="0"/>
+          <w:sz w:val="21"/>
+        </w:rPr>
+        <w:t>BOOT</w:t>
+      </w:r>
+      <w:r>
+        <w:rPr>
+          <w:sz w:val="21"/>
+        </w:rPr>
+        <w:t xml:space="preserve"> e aperte </w:t>
+      </w:r>
+      <w:r>
+        <w:rPr>
+          <w:b/>
+          <w:i w:val="0"/>
+          <w:sz w:val="21"/>
+        </w:rPr>
+        <w:t>RST</w:t>
+      </w:r>
+      <w:r>
+        <w:rPr>
+          <w:sz w:val="21"/>
+        </w:rPr>
+        <w:t>. O modo troca, fica salvo na flash e aparece no display por 3 segundos. Não é preciso regravar o firmware.</w:t>
       </w:r>
     </w:p>
     <w:p>
       <w:pPr>
-        <w:spacing w:after="40"/>
-        <w:ind w:left="360"/>
+        <w:spacing w:before="180" w:after="80"/>
       </w:pPr>
       <w:r>
         <w:rPr>
           <w:b/>
+          <w:color w:val="0071E3"/>
+          <w:sz w:val="23"/>
         </w:rPr>
-        <w:t xml:space="preserve">1. </w:t>
+        <w:t>5. Ensaio seco em casa (meia hora que vale muito)</w:t>
+      </w:r>
+    </w:p>
+    <w:p>
+      <w:r>
+        <w:rPr>
+          <w:sz w:val="21"/>
+        </w:rPr>
+        <w:t xml:space="preserve">Com o cinto pronto, rode </w:t>
       </w:r>
       <w:r>
-        <w:t>Ao ligar, a telinha do cinto mostra: "Config WiFi: rede Tortuga-Setup / senha tortuga123".</w:t>
+        <w:rPr>
+          <w:rFonts w:ascii="Consolas" w:hAnsi="Consolas"/>
+          <w:b w:val="0"/>
+          <w:i w:val="0"/>
+          <w:sz w:val="19"/>
+        </w:rPr>
+        <w:t>demo_limpo.bat</w:t>
+      </w:r>
+      <w:r>
+        <w:rPr>
+          <w:sz w:val="21"/>
+        </w:rPr>
+        <w:t xml:space="preserve"> em casa, com a webcam. Quando ele pedir o IP do ESP, digite </w:t>
+      </w:r>
+      <w:r>
+        <w:rPr>
+          <w:rFonts w:ascii="Consolas" w:hAnsi="Consolas"/>
+          <w:b w:val="0"/>
+          <w:i w:val="0"/>
+          <w:sz w:val="19"/>
+        </w:rPr>
+        <w:t>192.168.4.1</w:t>
+      </w:r>
+      <w:r>
+        <w:rPr>
+          <w:sz w:val="21"/>
+        </w:rPr>
+        <w:t>.</w:t>
+      </w:r>
+    </w:p>
+    <w:p>
+      <w:r>
+        <w:rPr>
+          <w:sz w:val="21"/>
+        </w:rPr>
+        <w:t xml:space="preserve">O objetivo não é testar o sistema, que já funciona — é </w:t>
+      </w:r>
+      <w:r>
+        <w:rPr>
+          <w:b/>
+          <w:i w:val="0"/>
+          <w:sz w:val="21"/>
+        </w:rPr>
+        <w:t>praticar o gesto de traçar a área útil</w:t>
+      </w:r>
+      <w:r>
+        <w:rPr>
+          <w:sz w:val="21"/>
+        </w:rPr>
+        <w:t xml:space="preserve"> no </w:t>
+      </w:r>
+      <w:r>
+        <w:rPr>
+          <w:rFonts w:ascii="Consolas" w:hAnsi="Consolas"/>
+          <w:b w:val="0"/>
+          <w:i w:val="0"/>
+          <w:sz w:val="19"/>
+        </w:rPr>
+        <w:t>/config</w:t>
+      </w:r>
+      <w:r>
+        <w:rPr>
+          <w:sz w:val="21"/>
+        </w:rPr>
+        <w:t xml:space="preserve"> uma vez, ver o lado de fora escurecer no vídeo e entender como ela se comporta. No dia você repete isso em 30 segundos, em vez de descobrir na hora.</w:t>
       </w:r>
     </w:p>
     <w:p>
       <w:pPr>
-        <w:spacing w:after="40"/>
-        <w:ind w:left="360"/>
+        <w:spacing w:before="180" w:after="80"/>
       </w:pPr>
       <w:r>
         <w:rPr>
           <w:b/>
+          <w:color w:val="0071E3"/>
+          <w:sz w:val="23"/>
         </w:rPr>
-        <w:t xml:space="preserve">2. </w:t>
-      </w:r>
-      <w:r>
-        <w:t>No celular, entre na rede Wi-Fi "Tortuga-Setup" (senha tortuga123).</w:t>
-      </w:r>
-    </w:p>
-    <w:p>
-      <w:pPr>
-        <w:spacing w:after="40"/>
-        <w:ind w:left="360"/>
-      </w:pPr>
-      <w:r>
-        <w:rPr>
-          <w:b/>
-        </w:rPr>
-        <w:t xml:space="preserve">3. </w:t>
-      </w:r>
-      <w:r>
-        <w:t>Abre uma página automaticamente (se não abrir, digite 192.168.4.1 no navegador).</w:t>
-      </w:r>
-    </w:p>
-    <w:p>
-      <w:pPr>
-        <w:spacing w:after="40"/>
-        <w:ind w:left="360"/>
-      </w:pPr>
-      <w:r>
-        <w:rPr>
-          <w:b/>
-        </w:rPr>
-        <w:t xml:space="preserve">4. </w:t>
-      </w:r>
-      <w:r>
-        <w:t>Escolha a sua rede local, digite a senha e salve. O ESP reinicia e conecta.</w:t>
+        <w:t>6. Se algo der errado</w:t>
       </w:r>
     </w:p>
     <w:tbl>
       <w:tblPr>
+        <w:tblStyle w:val="TableGrid"/>
         <w:tblW w:type="auto" w:w="0"/>
         <w:tblLook w:firstColumn="1" w:firstRow="1" w:lastColumn="0" w:lastRow="0" w:noHBand="0" w:noVBand="1" w:val="04A0"/>
-        <w:tblBorders>
-          <w:top w:val="single" w:sz="4" w:color="D2D2D7"/>
-          <w:left w:val="single" w:sz="4" w:color="D2D2D7"/>
-          <w:bottom w:val="single" w:sz="4" w:color="D2D2D7"/>
-          <w:right w:val="single" w:sz="4" w:color="D2D2D7"/>
-          <w:insideH w:val="single" w:sz="4" w:color="D2D2D7"/>
-          <w:insideV w:val="single" w:sz="4" w:color="D2D2D7"/>
-        </w:tblBorders>
       </w:tblPr>
       <w:tblGrid>
-        <w:gridCol w:w="9936"/>
+        <w:gridCol w:w="5040"/>
+        <w:gridCol w:w="5040"/>
       </w:tblGrid>
       <w:tr>
         <w:tc>
           <w:tcPr>
-            <w:tcW w:type="dxa" w:w="9936"/>
-            <w:shd w:val="clear" w:fill="FFF6EC"/>
+            <w:tcW w:type="dxa" w:w="3744"/>
+            <w:shd w:val="clear" w:fill="EAF2FD"/>
           </w:tcPr>
           <w:p>
-            <w:pPr>
-              <w:spacing w:after="20"/>
-            </w:pPr>
+            <w:r/>
             <w:r>
               <w:rPr>
                 <w:b/>
-                <w:color w:val="1D1D1F"/>
+                <w:color w:val="0071E3"/>
+                <w:sz w:val="19"/>
               </w:rPr>
-              <w:t xml:space="preserve">Na metaindústria: </w:t>
+              <w:t>Sintoma</w:t>
             </w:r>
+          </w:p>
+        </w:tc>
+        <w:tc>
+          <w:tcPr>
+            <w:tcW w:type="dxa" w:w="6336"/>
+            <w:shd w:val="clear" w:fill="EAF2FD"/>
+          </w:tcPr>
+          <w:p>
+            <w:r/>
             <w:r>
               <w:rPr>
-                <w:b w:val="0"/>
+                <w:b/>
+                <w:color w:val="0071E3"/>
+                <w:sz w:val="19"/>
               </w:rPr>
-              <w:t>como a rede de casa não estará lá, o portal abre sozinho — basta reconfigurar com a Wi-Fi de lá. Para apagar a rede salva à força: segure BOOT e aperte EN/RST.</w:t>
+              <w:t>O que fazer</w:t>
+            </w:r>
+          </w:p>
+        </w:tc>
+      </w:tr>
+      <w:tr>
+        <w:tc>
+          <w:tcPr>
+            <w:tcW w:type="dxa" w:w="3744"/>
+          </w:tcPr>
+          <w:p>
+            <w:r/>
+            <w:r>
+              <w:rPr>
+                <w:sz w:val="19"/>
+              </w:rPr>
+              <w:t>O display não mostra “CINTO = PONTO ACESSO”</w:t>
+            </w:r>
+          </w:p>
+        </w:tc>
+        <w:tc>
+          <w:tcPr>
+            <w:tcW w:type="dxa" w:w="6336"/>
+          </w:tcPr>
+          <w:p>
+            <w:r/>
+            <w:r>
+              <w:rPr>
+                <w:sz w:val="19"/>
+              </w:rPr>
+              <w:t>O BOOT ficou segurado no reset e alternou o modo. Segure BOOT + RST uma vez para voltar ao AP.</w:t>
+            </w:r>
+          </w:p>
+        </w:tc>
+      </w:tr>
+      <w:tr>
+        <w:tc>
+          <w:tcPr>
+            <w:tcW w:type="dxa" w:w="3744"/>
+          </w:tcPr>
+          <w:p>
+            <w:r/>
+            <w:r>
+              <w:rPr>
+                <w:sz w:val="19"/>
+              </w:rPr>
+              <w:t>192.168.4.1 não abre no navegador</w:t>
+            </w:r>
+          </w:p>
+        </w:tc>
+        <w:tc>
+          <w:tcPr>
+            <w:tcW w:type="dxa" w:w="6336"/>
+          </w:tcPr>
+          <w:p>
+            <w:r/>
+            <w:r>
+              <w:rPr>
+                <w:sz w:val="19"/>
+              </w:rPr>
+              <w:t>O notebook não está na rede do cinto. Confira o Wi-Fi — o cabo de rede não serve para falar com o cinto.</w:t>
+            </w:r>
+          </w:p>
+        </w:tc>
+      </w:tr>
+      <w:tr>
+        <w:tc>
+          <w:tcPr>
+            <w:tcW w:type="dxa" w:w="3744"/>
+          </w:tcPr>
+          <w:p>
+            <w:r/>
+            <w:r>
+              <w:rPr>
+                <w:sz w:val="19"/>
+              </w:rPr>
+              <w:t>Erro de compilação em Preferences.h</w:t>
+            </w:r>
+          </w:p>
+        </w:tc>
+        <w:tc>
+          <w:tcPr>
+            <w:tcW w:type="dxa" w:w="6336"/>
+          </w:tcPr>
+          <w:p>
+            <w:r/>
+            <w:r>
+              <w:rPr>
+                <w:sz w:val="19"/>
+              </w:rPr>
+              <w:t>O pacote de placas ESP32 está desatualizado. Tools → Boards Manager → atualize o esp32.</w:t>
+            </w:r>
+          </w:p>
+        </w:tc>
+      </w:tr>
+      <w:tr>
+        <w:tc>
+          <w:tcPr>
+            <w:tcW w:type="dxa" w:w="3744"/>
+          </w:tcPr>
+          <w:p>
+            <w:r/>
+            <w:r>
+              <w:rPr>
+                <w:sz w:val="19"/>
+              </w:rPr>
+              <w:t>Não aparece porta COM</w:t>
+            </w:r>
+          </w:p>
+        </w:tc>
+        <w:tc>
+          <w:tcPr>
+            <w:tcW w:type="dxa" w:w="6336"/>
+          </w:tcPr>
+          <w:p>
+            <w:r/>
+            <w:r>
+              <w:rPr>
+                <w:sz w:val="19"/>
+              </w:rPr>
+              <w:t>Falta o driver CP210x. Instale e reconecte o cabo.</w:t>
+            </w:r>
+          </w:p>
+        </w:tc>
+      </w:tr>
+      <w:tr>
+        <w:tc>
+          <w:tcPr>
+            <w:tcW w:type="dxa" w:w="3744"/>
+          </w:tcPr>
+          <w:p>
+            <w:r/>
+            <w:r>
+              <w:rPr>
+                <w:sz w:val="19"/>
+              </w:rPr>
+              <w:t>Trava em “Connecting…”</w:t>
+            </w:r>
+          </w:p>
+        </w:tc>
+        <w:tc>
+          <w:tcPr>
+            <w:tcW w:type="dxa" w:w="6336"/>
+          </w:tcPr>
+          <w:p>
+            <w:r/>
+            <w:r>
+              <w:rPr>
+                <w:sz w:val="19"/>
+              </w:rPr>
+              <w:t>Segure o botão BOOT durante a conexão, até a gravação começar.</w:t>
+            </w:r>
+          </w:p>
+        </w:tc>
+      </w:tr>
+      <w:tr>
+        <w:tc>
+          <w:tcPr>
+            <w:tcW w:type="dxa" w:w="3744"/>
+          </w:tcPr>
+          <w:p>
+            <w:r/>
+            <w:r>
+              <w:rPr>
+                <w:sz w:val="19"/>
+              </w:rPr>
+              <w:t>Cinto não reage ao teste</w:t>
+            </w:r>
+          </w:p>
+        </w:tc>
+        <w:tc>
+          <w:tcPr>
+            <w:tcW w:type="dxa" w:w="6336"/>
+          </w:tcPr>
+          <w:p>
+            <w:r/>
+            <w:r>
+              <w:rPr>
+                <w:sz w:val="19"/>
+              </w:rPr>
+              <w:t>Confirme que http://192.168.4.1/ abre. Se abrir e mesmo assim não reagir, confira as pilhas/power bank.</w:t>
+            </w:r>
+          </w:p>
+        </w:tc>
+      </w:tr>
+      <w:tr>
+        <w:tc>
+          <w:tcPr>
+            <w:tcW w:type="dxa" w:w="3744"/>
+          </w:tcPr>
+          <w:p>
+            <w:r/>
+            <w:r>
+              <w:rPr>
+                <w:sz w:val="19"/>
+              </w:rPr>
+              <w:t>Cinto reinicia sozinho (tela piscando)</w:t>
+            </w:r>
+          </w:p>
+        </w:tc>
+        <w:tc>
+          <w:tcPr>
+            <w:tcW w:type="dxa" w:w="6336"/>
+          </w:tcPr>
+          <w:p>
+            <w:r/>
+            <w:r>
+              <w:rPr>
+                <w:sz w:val="19"/>
+              </w:rPr>
+              <w:t>Queda de tensão sob pico de corrente. Use o power bank USB, não pilhas — ver §6.1 da documentação da Fase 4.</w:t>
             </w:r>
           </w:p>
         </w:tc>
@@ -579,147 +1501,108 @@
     </w:p>
     <w:p>
       <w:pPr>
-        <w:spacing w:before="160" w:after="40"/>
+        <w:spacing w:before="180" w:after="80"/>
       </w:pPr>
       <w:r>
         <w:rPr>
           <w:b/>
           <w:color w:val="0071E3"/>
-          <w:sz w:val="26"/>
+          <w:sz w:val="23"/>
         </w:rPr>
-        <w:t>7. Descobrir o IP do ESP</w:t>
+        <w:t>7. Plano B — voltar ao firmware anterior</w:t>
       </w:r>
     </w:p>
     <w:p>
-      <w:pPr>
-        <w:spacing w:after="60"/>
-        <w:jc w:val="both"/>
-      </w:pPr>
       <w:r>
         <w:rPr>
-          <w:b w:val="0"/>
+          <w:sz w:val="21"/>
         </w:rPr>
-        <w:t xml:space="preserve">Abra o </w:t>
+        <w:t xml:space="preserve">O firmware que você usava antes está guardado em </w:t>
       </w:r>
       <w:r>
         <w:rPr>
-          <w:b/>
+          <w:rFonts w:ascii="Consolas" w:hAnsi="Consolas"/>
+          <w:b w:val="0"/>
+          <w:i w:val="0"/>
+          <w:sz w:val="19"/>
         </w:rPr>
-        <w:t>Serial Monitor</w:t>
+        <w:t>firmware\tortuga_esp32\tortuga_esp32.ino.ANTES-AP</w:t>
       </w:r>
       <w:r>
         <w:rPr>
-          <w:b w:val="0"/>
+          <w:sz w:val="21"/>
         </w:rPr>
-        <w:t xml:space="preserve"> (ícone de lupa, canto superior direito) e ajuste a velocidade para </w:t>
+        <w:t xml:space="preserve">. Para voltar, renomeie para </w:t>
       </w:r>
       <w:r>
         <w:rPr>
-          <w:b/>
+          <w:rFonts w:ascii="Consolas" w:hAnsi="Consolas"/>
+          <w:b w:val="0"/>
+          <w:i w:val="0"/>
+          <w:sz w:val="19"/>
         </w:rPr>
-        <w:t>115200 baud</w:t>
+        <w:t>.ino</w:t>
       </w:r>
       <w:r>
         <w:rPr>
-          <w:b w:val="0"/>
+          <w:sz w:val="21"/>
         </w:rPr>
-        <w:t xml:space="preserve"> no menu à direita do painel. Aperte EN/RST no ESP: aparece a linha </w:t>
+        <w:t xml:space="preserve"> e grave normalmente. Ele usa o portal de Wi-Fi e depende de um hotspot disponível.</w:t>
+      </w:r>
+    </w:p>
+    <w:p>
+      <w:r>
+        <w:rPr>
+          <w:color w:val="6E6E73"/>
+          <w:sz w:val="19"/>
+        </w:rPr>
+        <w:t xml:space="preserve">Há ainda a versão de Wi-Fi fixo em </w:t>
       </w:r>
       <w:r>
         <w:rPr>
-          <w:b/>
+          <w:rFonts w:ascii="Consolas" w:hAnsi="Consolas"/>
+          <w:b w:val="0"/>
+          <w:i w:val="0"/>
+          <w:color w:val="6E6E73"/>
+          <w:sz w:val="19"/>
         </w:rPr>
-        <w:t>"IP do ESP32: ..."</w:t>
+        <w:t>firmware\_backup_wifi_fixo\</w:t>
       </w:r>
       <w:r>
         <w:rPr>
-          <w:b w:val="0"/>
+          <w:color w:val="6E6E73"/>
+          <w:sz w:val="19"/>
         </w:rPr>
-        <w:t>. Anote esse IP.</w:t>
-      </w:r>
-    </w:p>
-    <w:p>
-      <w:pPr>
-        <w:spacing w:before="160" w:after="40"/>
-      </w:pPr>
-      <w:r>
-        <w:rPr>
-          <w:b/>
-          <w:color w:val="0071E3"/>
-          <w:sz w:val="26"/>
-        </w:rPr>
-        <w:t>8. Registrar o IP no Tortuga</w:t>
-      </w:r>
-    </w:p>
-    <w:p>
-      <w:pPr>
-        <w:spacing w:after="60"/>
-        <w:jc w:val="both"/>
-      </w:pPr>
-      <w:r>
-        <w:rPr>
-          <w:b w:val="0"/>
-        </w:rPr>
-        <w:t xml:space="preserve">Rode </w:t>
-      </w:r>
-      <w:r>
-        <w:rPr>
-          <w:b/>
-        </w:rPr>
-        <w:t>set_esp.bat</w:t>
-      </w:r>
-      <w:r>
-        <w:rPr>
-          <w:b w:val="0"/>
-        </w:rPr>
-        <w:t xml:space="preserve"> (demo em casa) ou </w:t>
-      </w:r>
-      <w:r>
-        <w:rPr>
-          <w:b/>
-        </w:rPr>
-        <w:t>set_esp_metaindustria.bat</w:t>
-      </w:r>
-      <w:r>
-        <w:rPr>
-          <w:b w:val="0"/>
-        </w:rPr>
-        <w:t xml:space="preserve"> (na metaindústria, registra as 4 câmeras) e digite o IP.</w:t>
+        <w:t>, caso precise de algo sem portal nenhum.</w:t>
       </w:r>
     </w:p>
     <w:tbl>
       <w:tblPr>
         <w:tblW w:type="auto" w:w="0"/>
+        <w:jc w:val="center"/>
         <w:tblLook w:firstColumn="1" w:firstRow="1" w:lastColumn="0" w:lastRow="0" w:noHBand="0" w:noVBand="1" w:val="04A0"/>
-        <w:tblBorders>
-          <w:top w:val="single" w:sz="4" w:color="D2D2D7"/>
-          <w:left w:val="single" w:sz="4" w:color="D2D2D7"/>
-          <w:bottom w:val="single" w:sz="4" w:color="D2D2D7"/>
-          <w:right w:val="single" w:sz="4" w:color="D2D2D7"/>
-          <w:insideH w:val="single" w:sz="4" w:color="D2D2D7"/>
-          <w:insideV w:val="single" w:sz="4" w:color="D2D2D7"/>
-        </w:tblBorders>
       </w:tblPr>
       <w:tblGrid>
-        <w:gridCol w:w="9936"/>
+        <w:gridCol w:w="10080"/>
       </w:tblGrid>
       <w:tr>
         <w:tc>
           <w:tcPr>
-            <w:tcW w:type="dxa" w:w="9936"/>
-            <w:shd w:val="clear" w:fill="F2F3F5"/>
+            <w:tcW w:type="dxa" w:w="10080"/>
+            <w:shd w:val="clear" w:fill="F0F6FE"/>
           </w:tcPr>
           <w:p>
             <w:pPr>
-              <w:spacing w:after="0"/>
+              <w:spacing w:after="60"/>
             </w:pPr>
+            <w:r/>
             <w:r>
               <w:rPr>
-                <w:rFonts w:ascii="Consolas" w:hAnsi="Consolas"/>
-                <w:color w:val="1D1D1F"/>
-                <w:sz w:val="19"/>
+                <w:b/>
+                <w:color w:val="0071E3"/>
+                <w:sz w:val="21"/>
               </w:rPr>
-              <w:t>C:\tortuga\set_esp.bat            (casa)</w:t>
+              <w:t>Resumo</w:t>
             </w:r>
           </w:p>
           <w:p>
@@ -728,441 +1611,92 @@
             </w:pPr>
             <w:r>
               <w:rPr>
+                <w:sz w:val="20"/>
+              </w:rPr>
+              <w:t xml:space="preserve">Abrir o </w:t>
+            </w:r>
+            <w:r>
+              <w:rPr>
                 <w:rFonts w:ascii="Consolas" w:hAnsi="Consolas"/>
-                <w:color w:val="1D1D1F"/>
+                <w:b w:val="0"/>
                 <w:sz w:val="19"/>
               </w:rPr>
-              <w:t>C:\tortuga\set_esp_metaindustria.bat  (metaindustria)</w:t>
+              <w:t>.ino</w:t>
             </w:r>
-          </w:p>
-        </w:tc>
-      </w:tr>
-    </w:tbl>
-    <w:p>
-      <w:pPr>
-        <w:spacing w:after="40"/>
-      </w:pPr>
-    </w:p>
-    <w:p>
-      <w:pPr>
-        <w:spacing w:before="160" w:after="40"/>
-      </w:pPr>
-      <w:r>
-        <w:rPr>
-          <w:b/>
-          <w:color w:val="0071E3"/>
-          <w:sz w:val="26"/>
-        </w:rPr>
-        <w:t>9. Testar</w:t>
-      </w:r>
-    </w:p>
-    <w:p>
-      <w:pPr>
-        <w:spacing w:after="60"/>
-        <w:jc w:val="both"/>
-      </w:pPr>
-      <w:r>
-        <w:rPr>
-          <w:b w:val="0"/>
-        </w:rPr>
-        <w:t xml:space="preserve">Rode </w:t>
-      </w:r>
-      <w:r>
-        <w:rPr>
-          <w:b/>
-        </w:rPr>
-        <w:t>run_demo.bat</w:t>
-      </w:r>
-      <w:r>
-        <w:rPr>
-          <w:b w:val="0"/>
-        </w:rPr>
-        <w:t xml:space="preserve"> (casa) ou </w:t>
-      </w:r>
-      <w:r>
-        <w:rPr>
-          <w:b/>
-        </w:rPr>
-        <w:t>run_metaindustria.bat</w:t>
-      </w:r>
-      <w:r>
-        <w:rPr>
-          <w:b w:val="0"/>
-        </w:rPr>
-        <w:t xml:space="preserve">, valide com </w:t>
-      </w:r>
-      <w:r>
-        <w:rPr>
-          <w:b/>
-        </w:rPr>
-        <w:t>run_esp_test.bat</w:t>
-      </w:r>
-      <w:r>
-        <w:rPr>
-          <w:b w:val="0"/>
-        </w:rPr>
-        <w:t xml:space="preserve"> (deve dar 3/3 OK) e tire o capacete na frente da câmera — o cinto acende vermelho + buzzer + vibração.</w:t>
-      </w:r>
-    </w:p>
-    <w:p>
-      <w:pPr>
-        <w:spacing w:before="160" w:after="40"/>
-      </w:pPr>
-      <w:r>
-        <w:rPr>
-          <w:b/>
-          <w:color w:val="0071E3"/>
-          <w:sz w:val="26"/>
-        </w:rPr>
-        <w:t>10. Solução de problemas</w:t>
-      </w:r>
-    </w:p>
-    <w:tbl>
-      <w:tblPr>
-        <w:tblW w:type="auto" w:w="0"/>
-        <w:tblLook w:firstColumn="1" w:firstRow="1" w:lastColumn="0" w:lastRow="0" w:noHBand="0" w:noVBand="1" w:val="04A0"/>
-        <w:tblBorders>
-          <w:top w:val="single" w:sz="4" w:color="D2D2D7"/>
-          <w:left w:val="single" w:sz="4" w:color="D2D2D7"/>
-          <w:bottom w:val="single" w:sz="4" w:color="D2D2D7"/>
-          <w:right w:val="single" w:sz="4" w:color="D2D2D7"/>
-          <w:insideH w:val="single" w:sz="4" w:color="D2D2D7"/>
-          <w:insideV w:val="single" w:sz="4" w:color="D2D2D7"/>
-        </w:tblBorders>
-      </w:tblPr>
-      <w:tblGrid>
-        <w:gridCol w:w="4968"/>
-        <w:gridCol w:w="4968"/>
-      </w:tblGrid>
-      <w:tr>
-        <w:tc>
-          <w:tcPr>
-            <w:tcW w:type="dxa" w:w="3456"/>
-            <w:shd w:val="clear" w:fill="E6F1FB"/>
-          </w:tcPr>
-          <w:p>
-            <w:pPr>
-              <w:spacing w:after="20"/>
-            </w:pPr>
+            <w:r>
+              <w:rPr>
+                <w:sz w:val="20"/>
+              </w:rPr>
+              <w:t xml:space="preserve"> → placa ESP32 Dev Module → Upload → </w:t>
+            </w:r>
             <w:r>
               <w:rPr>
                 <w:b/>
-                <w:sz w:val="19"/>
+                <w:sz w:val="20"/>
               </w:rPr>
-              <w:t>Sintoma</w:t>
-            </w:r>
-          </w:p>
-        </w:tc>
-        <w:tc>
-          <w:tcPr>
-            <w:tcW w:type="dxa" w:w="6480"/>
-            <w:shd w:val="clear" w:fill="E6F1FB"/>
-          </w:tcPr>
-          <w:p>
-            <w:pPr>
-              <w:spacing w:after="20"/>
-            </w:pPr>
-            <w:r>
-              <w:rPr>
-                <w:b/>
-                <w:sz w:val="19"/>
-              </w:rPr>
-              <w:t>O que fazer</w:t>
-            </w:r>
-          </w:p>
-        </w:tc>
-      </w:tr>
-      <w:tr>
-        <w:tc>
-          <w:tcPr>
-            <w:tcW w:type="dxa" w:w="3456"/>
-          </w:tcPr>
-          <w:p>
-            <w:pPr>
-              <w:spacing w:after="20"/>
-            </w:pPr>
-            <w:r>
-              <w:rPr>
-                <w:b/>
-                <w:sz w:val="19"/>
-              </w:rPr>
-              <w:t>Erro de compilação "WiFiManager.h"</w:t>
-            </w:r>
-          </w:p>
-        </w:tc>
-        <w:tc>
-          <w:tcPr>
-            <w:tcW w:type="dxa" w:w="6480"/>
-          </w:tcPr>
-          <w:p>
-            <w:pPr>
-              <w:spacing w:after="20"/>
-            </w:pPr>
-            <w:r>
-              <w:rPr>
-                <w:sz w:val="19"/>
-              </w:rPr>
-              <w:t>Instale a lib WiFiManager (by tzapu) — passo 2.</w:t>
-            </w:r>
-          </w:p>
-        </w:tc>
-      </w:tr>
-      <w:tr>
-        <w:tc>
-          <w:tcPr>
-            <w:tcW w:type="dxa" w:w="3456"/>
-          </w:tcPr>
-          <w:p>
-            <w:pPr>
-              <w:spacing w:after="20"/>
-            </w:pPr>
-            <w:r>
-              <w:rPr>
-                <w:b/>
-                <w:sz w:val="19"/>
-              </w:rPr>
-              <w:t>Não aparece porta COM</w:t>
-            </w:r>
-          </w:p>
-        </w:tc>
-        <w:tc>
-          <w:tcPr>
-            <w:tcW w:type="dxa" w:w="6480"/>
-          </w:tcPr>
-          <w:p>
-            <w:pPr>
-              <w:spacing w:after="20"/>
-            </w:pPr>
-            <w:r>
-              <w:rPr>
-                <w:sz w:val="19"/>
-              </w:rPr>
-              <w:t>Instale o driver CP210x (passo 4) e reconecte o ESP.</w:t>
-            </w:r>
-          </w:p>
-        </w:tc>
-      </w:tr>
-      <w:tr>
-        <w:tc>
-          <w:tcPr>
-            <w:tcW w:type="dxa" w:w="3456"/>
-          </w:tcPr>
-          <w:p>
-            <w:pPr>
-              <w:spacing w:after="20"/>
-            </w:pPr>
-            <w:r>
-              <w:rPr>
-                <w:b/>
-                <w:sz w:val="19"/>
-              </w:rPr>
-              <w:t>Trava em "Connecting…"</w:t>
-            </w:r>
-          </w:p>
-        </w:tc>
-        <w:tc>
-          <w:tcPr>
-            <w:tcW w:type="dxa" w:w="6480"/>
-          </w:tcPr>
-          <w:p>
-            <w:pPr>
-              <w:spacing w:after="20"/>
-            </w:pPr>
-            <w:r>
-              <w:rPr>
-                <w:sz w:val="19"/>
-              </w:rPr>
-              <w:t>Segure o botão BOOT durante a conexão.</w:t>
-            </w:r>
-          </w:p>
-        </w:tc>
-      </w:tr>
-      <w:tr>
-        <w:tc>
-          <w:tcPr>
-            <w:tcW w:type="dxa" w:w="3456"/>
-          </w:tcPr>
-          <w:p>
-            <w:pPr>
-              <w:spacing w:after="20"/>
-            </w:pPr>
-            <w:r>
-              <w:rPr>
-                <w:b/>
-                <w:sz w:val="19"/>
-              </w:rPr>
-              <w:t>Portal não abre no celular</w:t>
-            </w:r>
-          </w:p>
-        </w:tc>
-        <w:tc>
-          <w:tcPr>
-            <w:tcW w:type="dxa" w:w="6480"/>
-          </w:tcPr>
-          <w:p>
-            <w:pPr>
-              <w:spacing w:after="20"/>
-            </w:pPr>
-            <w:r>
-              <w:rPr>
-                <w:sz w:val="19"/>
-              </w:rPr>
-              <w:t>Digite 192.168.4.1 no navegador; confirme que entrou na rede Tortuga-Setup.</w:t>
-            </w:r>
-          </w:p>
-        </w:tc>
-      </w:tr>
-      <w:tr>
-        <w:tc>
-          <w:tcPr>
-            <w:tcW w:type="dxa" w:w="3456"/>
-          </w:tcPr>
-          <w:p>
-            <w:pPr>
-              <w:spacing w:after="20"/>
-            </w:pPr>
-            <w:r>
-              <w:rPr>
-                <w:b/>
-                <w:sz w:val="19"/>
-              </w:rPr>
-              <w:t>Cinto não acende no teste</w:t>
-            </w:r>
-          </w:p>
-        </w:tc>
-        <w:tc>
-          <w:tcPr>
-            <w:tcW w:type="dxa" w:w="6480"/>
-          </w:tcPr>
-          <w:p>
-            <w:pPr>
-              <w:spacing w:after="20"/>
-            </w:pPr>
-            <w:r>
-              <w:rPr>
-                <w:sz w:val="19"/>
-              </w:rPr>
-              <w:t>Confirme o IP com set_esp*.bat; cinto e PC na MESMA rede 2,4 GHz.</w:t>
-            </w:r>
-          </w:p>
-        </w:tc>
-      </w:tr>
-      <w:tr>
-        <w:tc>
-          <w:tcPr>
-            <w:tcW w:type="dxa" w:w="3456"/>
-          </w:tcPr>
-          <w:p>
-            <w:pPr>
-              <w:spacing w:after="20"/>
-            </w:pPr>
-            <w:r>
-              <w:rPr>
-                <w:b/>
-                <w:sz w:val="19"/>
-              </w:rPr>
-              <w:t>Preciso trocar a rede salva</w:t>
-            </w:r>
-          </w:p>
-        </w:tc>
-        <w:tc>
-          <w:tcPr>
-            <w:tcW w:type="dxa" w:w="6480"/>
-          </w:tcPr>
-          <w:p>
-            <w:pPr>
-              <w:spacing w:after="20"/>
-            </w:pPr>
-            <w:r>
-              <w:rPr>
-                <w:sz w:val="19"/>
-              </w:rPr>
-              <w:t>Segure BOOT e aperte EN/RST para limpar; o portal reabre.</w:t>
-            </w:r>
-          </w:p>
-        </w:tc>
-      </w:tr>
-    </w:tbl>
-    <w:p>
-      <w:pPr>
-        <w:spacing w:after="40"/>
-      </w:pPr>
-    </w:p>
-    <w:p>
-      <w:pPr>
-        <w:spacing w:before="160" w:after="40"/>
-      </w:pPr>
-      <w:r>
-        <w:rPr>
-          <w:b/>
-          <w:color w:val="0071E3"/>
-          <w:sz w:val="26"/>
-        </w:rPr>
-        <w:t>11. Voltar ao firmware antigo (plano B)</w:t>
-      </w:r>
-    </w:p>
-    <w:p>
-      <w:pPr>
-        <w:spacing w:after="60"/>
-        <w:jc w:val="both"/>
-      </w:pPr>
-      <w:r>
-        <w:rPr>
-          <w:b w:val="0"/>
-        </w:rPr>
-        <w:t xml:space="preserve">Se o portal der problema, existe o firmware anterior (Wi-Fi fixo, já testado) em </w:t>
-      </w:r>
-      <w:r>
-        <w:rPr>
-          <w:b/>
-        </w:rPr>
-        <w:t>C:\tortuga\firmware\_backup_wifi_fixo\</w:t>
-      </w:r>
-      <w:r>
-        <w:rPr>
-          <w:b w:val="0"/>
-        </w:rPr>
-        <w:t>. As instruções de uso estão no LEIA-ME.txt dessa pasta.</w:t>
-      </w:r>
-    </w:p>
-    <w:tbl>
-      <w:tblPr>
-        <w:tblW w:type="auto" w:w="0"/>
-        <w:tblLook w:firstColumn="1" w:firstRow="1" w:lastColumn="0" w:lastRow="0" w:noHBand="0" w:noVBand="1" w:val="04A0"/>
-        <w:tblBorders>
-          <w:top w:val="single" w:sz="4" w:color="D2D2D7"/>
-          <w:left w:val="single" w:sz="4" w:color="D2D2D7"/>
-          <w:bottom w:val="single" w:sz="4" w:color="D2D2D7"/>
-          <w:right w:val="single" w:sz="4" w:color="D2D2D7"/>
-          <w:insideH w:val="single" w:sz="4" w:color="D2D2D7"/>
-          <w:insideV w:val="single" w:sz="4" w:color="D2D2D7"/>
-        </w:tblBorders>
-      </w:tblPr>
-      <w:tblGrid>
-        <w:gridCol w:w="9936"/>
-      </w:tblGrid>
-      <w:tr>
-        <w:tc>
-          <w:tcPr>
-            <w:tcW w:type="dxa" w:w="9936"/>
-            <w:shd w:val="clear" w:fill="FFF6EC"/>
-          </w:tcPr>
-          <w:p>
-            <w:pPr>
-              <w:spacing w:after="20"/>
-            </w:pPr>
-            <w:r>
-              <w:rPr>
-                <w:b/>
-                <w:color w:val="1D1D1F"/>
-              </w:rPr>
-              <w:t xml:space="preserve">Resumo. </w:t>
+              <w:t>RST sem BOOT</w:t>
             </w:r>
             <w:r>
               <w:rPr>
+                <w:sz w:val="20"/>
+              </w:rPr>
+              <w:t xml:space="preserve"> → o display mostra </w:t>
+            </w:r>
+            <w:r>
+              <w:rPr>
+                <w:rFonts w:ascii="Consolas" w:hAnsi="Consolas"/>
                 <w:b w:val="0"/>
+                <w:sz w:val="19"/>
               </w:rPr>
-              <w:t>Instalar WiFiManager → abrir o .ino → placa "ESP32 Dev Module" + porta COM → Upload → configurar Wi-Fi no portal Tortuga-Setup → ler o IP no Serial Monitor → set_esp → testar.</w:t>
+              <w:t>CINTO = PONTO ACESSO</w:t>
+            </w:r>
+            <w:r>
+              <w:rPr>
+                <w:sz w:val="20"/>
+              </w:rPr>
+              <w:t xml:space="preserve"> → conectar o Wi-Fi do notebook em </w:t>
+            </w:r>
+            <w:r>
+              <w:rPr>
+                <w:rFonts w:ascii="Consolas" w:hAnsi="Consolas"/>
+                <w:b w:val="0"/>
+                <w:sz w:val="19"/>
+              </w:rPr>
+              <w:t>Tortuga-Cinto</w:t>
+            </w:r>
+            <w:r>
+              <w:rPr>
+                <w:sz w:val="20"/>
+              </w:rPr>
+              <w:t xml:space="preserve"> → abrir </w:t>
+            </w:r>
+            <w:r>
+              <w:rPr>
+                <w:rFonts w:ascii="Consolas" w:hAnsi="Consolas"/>
+                <w:b w:val="0"/>
+                <w:sz w:val="19"/>
+              </w:rPr>
+              <w:t>http://192.168.4.1/</w:t>
+            </w:r>
+            <w:r>
+              <w:rPr>
+                <w:sz w:val="20"/>
+              </w:rPr>
+              <w:t xml:space="preserve"> → rodar </w:t>
+            </w:r>
+            <w:r>
+              <w:rPr>
+                <w:rFonts w:ascii="Consolas" w:hAnsi="Consolas"/>
+                <w:b w:val="0"/>
+                <w:sz w:val="19"/>
+              </w:rPr>
+              <w:t>testar_cinto.bat</w:t>
+            </w:r>
+            <w:r>
+              <w:rPr>
+                <w:sz w:val="20"/>
+              </w:rPr>
+              <w:t>.</w:t>
             </w:r>
           </w:p>
         </w:tc>
@@ -1175,7 +1709,7 @@
     </w:p>
     <w:sectPr>
       <w:pgSz w:w="12240" w:h="15840"/>
-      <w:pgMar w:top="1008" w:right="1152" w:bottom="864" w:left="1152" w:header="720" w:footer="720" w:gutter="0"/>
+      <w:pgMar w:top="1008" w:right="1080" w:bottom="1008" w:left="1080" w:header="720" w:footer="720" w:gutter="0"/>
       <w:cols w:space="720"/>
       <w:docGrid w:linePitch="360"/>
     </w:sectPr>
@@ -1546,9 +2080,11 @@
     <w:name w:val="Normal"/>
     <w:qFormat/>
     <w:rsid w:val="00FC693F"/>
+    <w:pPr>
+      <w:spacing w:after="100" w:line="274" w:lineRule="auto"/>
+    </w:pPr>
     <w:rPr>
       <w:rFonts w:ascii="Calibri" w:hAnsi="Calibri"/>
-      <w:color w:val="1D1D1F"/>
       <w:sz w:val="21"/>
     </w:rPr>
   </w:style>

</xml_diff>